<commit_message>
Update Conflict of Interest Policy to match actual practice
Support coordination conflict-of-interest handling reflects that we
make Clients aware of alternative providers and can obtain quotes on
request, rather than always sourcing 3 formal competing quotes. Also
fixes a missing 'not' in the repercussions clause.
</commit_message>
<xml_diff>
--- a/server/templates/library/conflict-of-interest-policy/template.docx
+++ b/server/templates/library/conflict-of-interest-policy/template.docx
@@ -1322,7 +1322,7 @@
         <w:rPr>
           <w:rtl w:val="0"/>
         </w:rPr>
-        <w:t xml:space="preserve">to ensure there is no conflict of interest, when our support coordinators obtain quotes for services on a Client’s behalf, endeavour to always provide 3 quotes (if possible) from other services, in addition to our own. It is then the Client’s decision if they would like to choose our services and supports or go with another provider. </w:t>
+        <w:t xml:space="preserve">to ensure there is no conflict of interest, our support coordinators make Clients aware of alternative providers for each support category and can help obtain comparative quotes if the Client requests them, in addition to our own. It is then the Client’s decision if they would like to choose our services and supports or go with another provider. </w:t>
       </w:r>
     </w:p>
     <w:p>
@@ -1350,7 +1350,7 @@
         <w:rPr>
           <w:rtl w:val="0"/>
         </w:rPr>
-        <w:t xml:space="preserve">make clear to the Client that their decision to choose an alternative provider will not affect their support coordination services at all, as they operate independently from each other, and that the Client need to be worried about any repercussions. </w:t>
+        <w:t xml:space="preserve">make clear to the Client that their decision to choose an alternative provider will not affect their support coordination services at all, as they operate independently from each other, and that the Client need not be worried about any repercussions. </w:t>
       </w:r>
     </w:p>
     <w:p>

</xml_diff>